<commit_message>
feat: se actualiza documentación
</commit_message>
<xml_diff>
--- a/Documentacion/entregas/Documentación modelo propensión.docx
+++ b/Documentacion/entregas/Documentación modelo propensión.docx
@@ -6887,9 +6887,8 @@
     </w:p>
     <w:tbl>
       <w:tblPr>
-        <w:tblStyle w:val="Cuadrculaclara-nfasis1"/>
+        <w:tblStyle w:val="Tablaconcuadrculaclara"/>
         <w:tblW w:w="0" w:type="auto"/>
-        <w:jc w:val="center"/>
         <w:tblLook w:val="04A0" w:firstRow="1" w:lastRow="0" w:firstColumn="1" w:lastColumn="0" w:noHBand="0" w:noVBand="1"/>
       </w:tblPr>
       <w:tblGrid>
@@ -6900,28 +6899,23 @@
         <w:gridCol w:w="1728"/>
       </w:tblGrid>
       <w:tr>
-        <w:trPr>
-          <w:cnfStyle w:val="100000000000" w:firstRow="1" w:lastRow="0" w:firstColumn="0" w:lastColumn="0" w:oddVBand="0" w:evenVBand="0" w:oddHBand="0" w:evenHBand="0" w:firstRowFirstColumn="0" w:firstRowLastColumn="0" w:lastRowFirstColumn="0" w:lastRowLastColumn="0"/>
-          <w:jc w:val="center"/>
-        </w:trPr>
-        <w:tc>
-          <w:tcPr>
-            <w:cnfStyle w:val="001000000000" w:firstRow="0" w:lastRow="0" w:firstColumn="1" w:lastColumn="0" w:oddVBand="0" w:evenVBand="0" w:oddHBand="0" w:evenHBand="0" w:firstRowFirstColumn="0" w:firstRowLastColumn="0" w:lastRowFirstColumn="0" w:lastRowLastColumn="0"/>
+        <w:tc>
+          <w:tcPr>
             <w:tcW w:w="1728" w:type="dxa"/>
           </w:tcPr>
           <w:p>
             <w:pPr>
               <w:rPr>
                 <w:rFonts w:ascii="Arial Narrow" w:hAnsi="Arial Narrow"/>
-                <w:sz w:val="24"/>
-                <w:szCs w:val="24"/>
-              </w:rPr>
-            </w:pPr>
-            <w:r>
-              <w:rPr>
-                <w:rFonts w:ascii="Arial Narrow" w:hAnsi="Arial Narrow"/>
-                <w:sz w:val="24"/>
-                <w:szCs w:val="24"/>
+                <w:sz w:val="20"/>
+                <w:szCs w:val="20"/>
+              </w:rPr>
+            </w:pPr>
+            <w:r>
+              <w:rPr>
+                <w:rFonts w:ascii="Arial Narrow" w:hAnsi="Arial Narrow"/>
+                <w:sz w:val="20"/>
+                <w:szCs w:val="20"/>
               </w:rPr>
               <w:t>Métrica</w:t>
             </w:r>
@@ -6933,18 +6927,17 @@
           </w:tcPr>
           <w:p>
             <w:pPr>
-              <w:cnfStyle w:val="100000000000" w:firstRow="1" w:lastRow="0" w:firstColumn="0" w:lastColumn="0" w:oddVBand="0" w:evenVBand="0" w:oddHBand="0" w:evenHBand="0" w:firstRowFirstColumn="0" w:firstRowLastColumn="0" w:lastRowFirstColumn="0" w:lastRowLastColumn="0"/>
-              <w:rPr>
-                <w:rFonts w:ascii="Arial Narrow" w:hAnsi="Arial Narrow"/>
-                <w:sz w:val="24"/>
-                <w:szCs w:val="24"/>
-              </w:rPr>
-            </w:pPr>
-            <w:r>
-              <w:rPr>
-                <w:rFonts w:ascii="Arial Narrow" w:hAnsi="Arial Narrow"/>
-                <w:sz w:val="24"/>
-                <w:szCs w:val="24"/>
+              <w:rPr>
+                <w:rFonts w:ascii="Arial Narrow" w:hAnsi="Arial Narrow"/>
+                <w:sz w:val="20"/>
+                <w:szCs w:val="20"/>
+              </w:rPr>
+            </w:pPr>
+            <w:r>
+              <w:rPr>
+                <w:rFonts w:ascii="Arial Narrow" w:hAnsi="Arial Narrow"/>
+                <w:sz w:val="20"/>
+                <w:szCs w:val="20"/>
               </w:rPr>
               <w:t>Logistic Regression</w:t>
             </w:r>
@@ -6956,18 +6949,17 @@
           </w:tcPr>
           <w:p>
             <w:pPr>
-              <w:cnfStyle w:val="100000000000" w:firstRow="1" w:lastRow="0" w:firstColumn="0" w:lastColumn="0" w:oddVBand="0" w:evenVBand="0" w:oddHBand="0" w:evenHBand="0" w:firstRowFirstColumn="0" w:firstRowLastColumn="0" w:lastRowFirstColumn="0" w:lastRowLastColumn="0"/>
-              <w:rPr>
-                <w:rFonts w:ascii="Arial Narrow" w:hAnsi="Arial Narrow"/>
-                <w:sz w:val="24"/>
-                <w:szCs w:val="24"/>
-              </w:rPr>
-            </w:pPr>
-            <w:r>
-              <w:rPr>
-                <w:rFonts w:ascii="Arial Narrow" w:hAnsi="Arial Narrow"/>
-                <w:sz w:val="24"/>
-                <w:szCs w:val="24"/>
+              <w:rPr>
+                <w:rFonts w:ascii="Arial Narrow" w:hAnsi="Arial Narrow"/>
+                <w:sz w:val="20"/>
+                <w:szCs w:val="20"/>
+              </w:rPr>
+            </w:pPr>
+            <w:r>
+              <w:rPr>
+                <w:rFonts w:ascii="Arial Narrow" w:hAnsi="Arial Narrow"/>
+                <w:sz w:val="20"/>
+                <w:szCs w:val="20"/>
               </w:rPr>
               <w:t>Random Forest</w:t>
             </w:r>
@@ -6979,18 +6971,17 @@
           </w:tcPr>
           <w:p>
             <w:pPr>
-              <w:cnfStyle w:val="100000000000" w:firstRow="1" w:lastRow="0" w:firstColumn="0" w:lastColumn="0" w:oddVBand="0" w:evenVBand="0" w:oddHBand="0" w:evenHBand="0" w:firstRowFirstColumn="0" w:firstRowLastColumn="0" w:lastRowFirstColumn="0" w:lastRowLastColumn="0"/>
-              <w:rPr>
-                <w:rFonts w:ascii="Arial Narrow" w:hAnsi="Arial Narrow"/>
-                <w:sz w:val="24"/>
-                <w:szCs w:val="24"/>
-              </w:rPr>
-            </w:pPr>
-            <w:r>
-              <w:rPr>
-                <w:rFonts w:ascii="Arial Narrow" w:hAnsi="Arial Narrow"/>
-                <w:sz w:val="24"/>
-                <w:szCs w:val="24"/>
+              <w:rPr>
+                <w:rFonts w:ascii="Arial Narrow" w:hAnsi="Arial Narrow"/>
+                <w:sz w:val="20"/>
+                <w:szCs w:val="20"/>
+              </w:rPr>
+            </w:pPr>
+            <w:r>
+              <w:rPr>
+                <w:rFonts w:ascii="Arial Narrow" w:hAnsi="Arial Narrow"/>
+                <w:sz w:val="20"/>
+                <w:szCs w:val="20"/>
               </w:rPr>
               <w:t>LightGBM</w:t>
             </w:r>
@@ -7002,18 +6993,17 @@
           </w:tcPr>
           <w:p>
             <w:pPr>
-              <w:cnfStyle w:val="100000000000" w:firstRow="1" w:lastRow="0" w:firstColumn="0" w:lastColumn="0" w:oddVBand="0" w:evenVBand="0" w:oddHBand="0" w:evenHBand="0" w:firstRowFirstColumn="0" w:firstRowLastColumn="0" w:lastRowFirstColumn="0" w:lastRowLastColumn="0"/>
-              <w:rPr>
-                <w:rFonts w:ascii="Arial Narrow" w:hAnsi="Arial Narrow"/>
-                <w:sz w:val="24"/>
-                <w:szCs w:val="24"/>
-              </w:rPr>
-            </w:pPr>
-            <w:r>
-              <w:rPr>
-                <w:rFonts w:ascii="Arial Narrow" w:hAnsi="Arial Narrow"/>
-                <w:sz w:val="24"/>
-                <w:szCs w:val="24"/>
+              <w:rPr>
+                <w:rFonts w:ascii="Arial Narrow" w:hAnsi="Arial Narrow"/>
+                <w:sz w:val="20"/>
+                <w:szCs w:val="20"/>
+              </w:rPr>
+            </w:pPr>
+            <w:r>
+              <w:rPr>
+                <w:rFonts w:ascii="Arial Narrow" w:hAnsi="Arial Narrow"/>
+                <w:sz w:val="20"/>
+                <w:szCs w:val="20"/>
               </w:rPr>
               <w:t>XGBoost</w:t>
             </w:r>
@@ -7021,28 +7011,23 @@
         </w:tc>
       </w:tr>
       <w:tr>
-        <w:trPr>
-          <w:cnfStyle w:val="000000100000" w:firstRow="0" w:lastRow="0" w:firstColumn="0" w:lastColumn="0" w:oddVBand="0" w:evenVBand="0" w:oddHBand="1" w:evenHBand="0" w:firstRowFirstColumn="0" w:firstRowLastColumn="0" w:lastRowFirstColumn="0" w:lastRowLastColumn="0"/>
-          <w:jc w:val="center"/>
-        </w:trPr>
-        <w:tc>
-          <w:tcPr>
-            <w:cnfStyle w:val="001000000000" w:firstRow="0" w:lastRow="0" w:firstColumn="1" w:lastColumn="0" w:oddVBand="0" w:evenVBand="0" w:oddHBand="0" w:evenHBand="0" w:firstRowFirstColumn="0" w:firstRowLastColumn="0" w:lastRowFirstColumn="0" w:lastRowLastColumn="0"/>
+        <w:tc>
+          <w:tcPr>
             <w:tcW w:w="1728" w:type="dxa"/>
           </w:tcPr>
           <w:p>
             <w:pPr>
               <w:rPr>
                 <w:rFonts w:ascii="Arial Narrow" w:hAnsi="Arial Narrow"/>
-                <w:sz w:val="24"/>
-                <w:szCs w:val="24"/>
-              </w:rPr>
-            </w:pPr>
-            <w:r>
-              <w:rPr>
-                <w:rFonts w:ascii="Arial Narrow" w:hAnsi="Arial Narrow"/>
-                <w:sz w:val="24"/>
-                <w:szCs w:val="24"/>
+                <w:sz w:val="20"/>
+                <w:szCs w:val="20"/>
+              </w:rPr>
+            </w:pPr>
+            <w:r>
+              <w:rPr>
+                <w:rFonts w:ascii="Arial Narrow" w:hAnsi="Arial Narrow"/>
+                <w:sz w:val="20"/>
+                <w:szCs w:val="20"/>
               </w:rPr>
               <w:t>AUC</w:t>
             </w:r>
@@ -7054,18 +7039,17 @@
           </w:tcPr>
           <w:p>
             <w:pPr>
-              <w:cnfStyle w:val="000000100000" w:firstRow="0" w:lastRow="0" w:firstColumn="0" w:lastColumn="0" w:oddVBand="0" w:evenVBand="0" w:oddHBand="1" w:evenHBand="0" w:firstRowFirstColumn="0" w:firstRowLastColumn="0" w:lastRowFirstColumn="0" w:lastRowLastColumn="0"/>
-              <w:rPr>
-                <w:rFonts w:ascii="Arial Narrow" w:hAnsi="Arial Narrow"/>
-                <w:sz w:val="24"/>
-                <w:szCs w:val="24"/>
-              </w:rPr>
-            </w:pPr>
-            <w:r>
-              <w:rPr>
-                <w:rFonts w:ascii="Arial Narrow" w:hAnsi="Arial Narrow"/>
-                <w:sz w:val="24"/>
-                <w:szCs w:val="24"/>
+              <w:rPr>
+                <w:rFonts w:ascii="Arial Narrow" w:hAnsi="Arial Narrow"/>
+                <w:sz w:val="20"/>
+                <w:szCs w:val="20"/>
+              </w:rPr>
+            </w:pPr>
+            <w:r>
+              <w:rPr>
+                <w:rFonts w:ascii="Arial Narrow" w:hAnsi="Arial Narrow"/>
+                <w:sz w:val="20"/>
+                <w:szCs w:val="20"/>
               </w:rPr>
               <w:t>~0.72</w:t>
             </w:r>
@@ -7077,18 +7061,17 @@
           </w:tcPr>
           <w:p>
             <w:pPr>
-              <w:cnfStyle w:val="000000100000" w:firstRow="0" w:lastRow="0" w:firstColumn="0" w:lastColumn="0" w:oddVBand="0" w:evenVBand="0" w:oddHBand="1" w:evenHBand="0" w:firstRowFirstColumn="0" w:firstRowLastColumn="0" w:lastRowFirstColumn="0" w:lastRowLastColumn="0"/>
-              <w:rPr>
-                <w:rFonts w:ascii="Arial Narrow" w:hAnsi="Arial Narrow"/>
-                <w:sz w:val="24"/>
-                <w:szCs w:val="24"/>
-              </w:rPr>
-            </w:pPr>
-            <w:r>
-              <w:rPr>
-                <w:rFonts w:ascii="Arial Narrow" w:hAnsi="Arial Narrow"/>
-                <w:sz w:val="24"/>
-                <w:szCs w:val="24"/>
+              <w:rPr>
+                <w:rFonts w:ascii="Arial Narrow" w:hAnsi="Arial Narrow"/>
+                <w:sz w:val="20"/>
+                <w:szCs w:val="20"/>
+              </w:rPr>
+            </w:pPr>
+            <w:r>
+              <w:rPr>
+                <w:rFonts w:ascii="Arial Narrow" w:hAnsi="Arial Narrow"/>
+                <w:sz w:val="20"/>
+                <w:szCs w:val="20"/>
               </w:rPr>
               <w:t>~0.76</w:t>
             </w:r>
@@ -7100,18 +7083,17 @@
           </w:tcPr>
           <w:p>
             <w:pPr>
-              <w:cnfStyle w:val="000000100000" w:firstRow="0" w:lastRow="0" w:firstColumn="0" w:lastColumn="0" w:oddVBand="0" w:evenVBand="0" w:oddHBand="1" w:evenHBand="0" w:firstRowFirstColumn="0" w:firstRowLastColumn="0" w:lastRowFirstColumn="0" w:lastRowLastColumn="0"/>
-              <w:rPr>
-                <w:rFonts w:ascii="Arial Narrow" w:hAnsi="Arial Narrow"/>
-                <w:sz w:val="24"/>
-                <w:szCs w:val="24"/>
-              </w:rPr>
-            </w:pPr>
-            <w:r>
-              <w:rPr>
-                <w:rFonts w:ascii="Arial Narrow" w:hAnsi="Arial Narrow"/>
-                <w:sz w:val="24"/>
-                <w:szCs w:val="24"/>
+              <w:rPr>
+                <w:rFonts w:ascii="Arial Narrow" w:hAnsi="Arial Narrow"/>
+                <w:sz w:val="20"/>
+                <w:szCs w:val="20"/>
+              </w:rPr>
+            </w:pPr>
+            <w:r>
+              <w:rPr>
+                <w:rFonts w:ascii="Arial Narrow" w:hAnsi="Arial Narrow"/>
+                <w:sz w:val="20"/>
+                <w:szCs w:val="20"/>
               </w:rPr>
               <w:t>~0.80</w:t>
             </w:r>
@@ -7123,18 +7105,17 @@
           </w:tcPr>
           <w:p>
             <w:pPr>
-              <w:cnfStyle w:val="000000100000" w:firstRow="0" w:lastRow="0" w:firstColumn="0" w:lastColumn="0" w:oddVBand="0" w:evenVBand="0" w:oddHBand="1" w:evenHBand="0" w:firstRowFirstColumn="0" w:firstRowLastColumn="0" w:lastRowFirstColumn="0" w:lastRowLastColumn="0"/>
-              <w:rPr>
-                <w:rFonts w:ascii="Arial Narrow" w:hAnsi="Arial Narrow"/>
-                <w:sz w:val="24"/>
-                <w:szCs w:val="24"/>
-              </w:rPr>
-            </w:pPr>
-            <w:r>
-              <w:rPr>
-                <w:rFonts w:ascii="Arial Narrow" w:hAnsi="Arial Narrow"/>
-                <w:sz w:val="24"/>
-                <w:szCs w:val="24"/>
+              <w:rPr>
+                <w:rFonts w:ascii="Arial Narrow" w:hAnsi="Arial Narrow"/>
+                <w:sz w:val="20"/>
+                <w:szCs w:val="20"/>
+              </w:rPr>
+            </w:pPr>
+            <w:r>
+              <w:rPr>
+                <w:rFonts w:ascii="Arial Narrow" w:hAnsi="Arial Narrow"/>
+                <w:sz w:val="20"/>
+                <w:szCs w:val="20"/>
               </w:rPr>
               <w:t>~0.79</w:t>
             </w:r>
@@ -7142,28 +7123,23 @@
         </w:tc>
       </w:tr>
       <w:tr>
-        <w:trPr>
-          <w:cnfStyle w:val="000000010000" w:firstRow="0" w:lastRow="0" w:firstColumn="0" w:lastColumn="0" w:oddVBand="0" w:evenVBand="0" w:oddHBand="0" w:evenHBand="1" w:firstRowFirstColumn="0" w:firstRowLastColumn="0" w:lastRowFirstColumn="0" w:lastRowLastColumn="0"/>
-          <w:jc w:val="center"/>
-        </w:trPr>
-        <w:tc>
-          <w:tcPr>
-            <w:cnfStyle w:val="001000000000" w:firstRow="0" w:lastRow="0" w:firstColumn="1" w:lastColumn="0" w:oddVBand="0" w:evenVBand="0" w:oddHBand="0" w:evenHBand="0" w:firstRowFirstColumn="0" w:firstRowLastColumn="0" w:lastRowFirstColumn="0" w:lastRowLastColumn="0"/>
+        <w:tc>
+          <w:tcPr>
             <w:tcW w:w="1728" w:type="dxa"/>
           </w:tcPr>
           <w:p>
             <w:pPr>
               <w:rPr>
                 <w:rFonts w:ascii="Arial Narrow" w:hAnsi="Arial Narrow"/>
-                <w:sz w:val="24"/>
-                <w:szCs w:val="24"/>
-              </w:rPr>
-            </w:pPr>
-            <w:r>
-              <w:rPr>
-                <w:rFonts w:ascii="Arial Narrow" w:hAnsi="Arial Narrow"/>
-                <w:sz w:val="24"/>
-                <w:szCs w:val="24"/>
+                <w:sz w:val="20"/>
+                <w:szCs w:val="20"/>
+              </w:rPr>
+            </w:pPr>
+            <w:r>
+              <w:rPr>
+                <w:rFonts w:ascii="Arial Narrow" w:hAnsi="Arial Narrow"/>
+                <w:sz w:val="20"/>
+                <w:szCs w:val="20"/>
               </w:rPr>
               <w:t>Gini</w:t>
             </w:r>
@@ -7175,18 +7151,17 @@
           </w:tcPr>
           <w:p>
             <w:pPr>
-              <w:cnfStyle w:val="000000010000" w:firstRow="0" w:lastRow="0" w:firstColumn="0" w:lastColumn="0" w:oddVBand="0" w:evenVBand="0" w:oddHBand="0" w:evenHBand="1" w:firstRowFirstColumn="0" w:firstRowLastColumn="0" w:lastRowFirstColumn="0" w:lastRowLastColumn="0"/>
-              <w:rPr>
-                <w:rFonts w:ascii="Arial Narrow" w:hAnsi="Arial Narrow"/>
-                <w:sz w:val="24"/>
-                <w:szCs w:val="24"/>
-              </w:rPr>
-            </w:pPr>
-            <w:r>
-              <w:rPr>
-                <w:rFonts w:ascii="Arial Narrow" w:hAnsi="Arial Narrow"/>
-                <w:sz w:val="24"/>
-                <w:szCs w:val="24"/>
+              <w:rPr>
+                <w:rFonts w:ascii="Arial Narrow" w:hAnsi="Arial Narrow"/>
+                <w:sz w:val="20"/>
+                <w:szCs w:val="20"/>
+              </w:rPr>
+            </w:pPr>
+            <w:r>
+              <w:rPr>
+                <w:rFonts w:ascii="Arial Narrow" w:hAnsi="Arial Narrow"/>
+                <w:sz w:val="20"/>
+                <w:szCs w:val="20"/>
               </w:rPr>
               <w:t>~0.44</w:t>
             </w:r>
@@ -7198,18 +7173,17 @@
           </w:tcPr>
           <w:p>
             <w:pPr>
-              <w:cnfStyle w:val="000000010000" w:firstRow="0" w:lastRow="0" w:firstColumn="0" w:lastColumn="0" w:oddVBand="0" w:evenVBand="0" w:oddHBand="0" w:evenHBand="1" w:firstRowFirstColumn="0" w:firstRowLastColumn="0" w:lastRowFirstColumn="0" w:lastRowLastColumn="0"/>
-              <w:rPr>
-                <w:rFonts w:ascii="Arial Narrow" w:hAnsi="Arial Narrow"/>
-                <w:sz w:val="24"/>
-                <w:szCs w:val="24"/>
-              </w:rPr>
-            </w:pPr>
-            <w:r>
-              <w:rPr>
-                <w:rFonts w:ascii="Arial Narrow" w:hAnsi="Arial Narrow"/>
-                <w:sz w:val="24"/>
-                <w:szCs w:val="24"/>
+              <w:rPr>
+                <w:rFonts w:ascii="Arial Narrow" w:hAnsi="Arial Narrow"/>
+                <w:sz w:val="20"/>
+                <w:szCs w:val="20"/>
+              </w:rPr>
+            </w:pPr>
+            <w:r>
+              <w:rPr>
+                <w:rFonts w:ascii="Arial Narrow" w:hAnsi="Arial Narrow"/>
+                <w:sz w:val="20"/>
+                <w:szCs w:val="20"/>
               </w:rPr>
               <w:t>~0.52</w:t>
             </w:r>
@@ -7221,18 +7195,17 @@
           </w:tcPr>
           <w:p>
             <w:pPr>
-              <w:cnfStyle w:val="000000010000" w:firstRow="0" w:lastRow="0" w:firstColumn="0" w:lastColumn="0" w:oddVBand="0" w:evenVBand="0" w:oddHBand="0" w:evenHBand="1" w:firstRowFirstColumn="0" w:firstRowLastColumn="0" w:lastRowFirstColumn="0" w:lastRowLastColumn="0"/>
-              <w:rPr>
-                <w:rFonts w:ascii="Arial Narrow" w:hAnsi="Arial Narrow"/>
-                <w:sz w:val="24"/>
-                <w:szCs w:val="24"/>
-              </w:rPr>
-            </w:pPr>
-            <w:r>
-              <w:rPr>
-                <w:rFonts w:ascii="Arial Narrow" w:hAnsi="Arial Narrow"/>
-                <w:sz w:val="24"/>
-                <w:szCs w:val="24"/>
+              <w:rPr>
+                <w:rFonts w:ascii="Arial Narrow" w:hAnsi="Arial Narrow"/>
+                <w:sz w:val="20"/>
+                <w:szCs w:val="20"/>
+              </w:rPr>
+            </w:pPr>
+            <w:r>
+              <w:rPr>
+                <w:rFonts w:ascii="Arial Narrow" w:hAnsi="Arial Narrow"/>
+                <w:sz w:val="20"/>
+                <w:szCs w:val="20"/>
               </w:rPr>
               <w:t>~0.60</w:t>
             </w:r>
@@ -7244,18 +7217,17 @@
           </w:tcPr>
           <w:p>
             <w:pPr>
-              <w:cnfStyle w:val="000000010000" w:firstRow="0" w:lastRow="0" w:firstColumn="0" w:lastColumn="0" w:oddVBand="0" w:evenVBand="0" w:oddHBand="0" w:evenHBand="1" w:firstRowFirstColumn="0" w:firstRowLastColumn="0" w:lastRowFirstColumn="0" w:lastRowLastColumn="0"/>
-              <w:rPr>
-                <w:rFonts w:ascii="Arial Narrow" w:hAnsi="Arial Narrow"/>
-                <w:sz w:val="24"/>
-                <w:szCs w:val="24"/>
-              </w:rPr>
-            </w:pPr>
-            <w:r>
-              <w:rPr>
-                <w:rFonts w:ascii="Arial Narrow" w:hAnsi="Arial Narrow"/>
-                <w:sz w:val="24"/>
-                <w:szCs w:val="24"/>
+              <w:rPr>
+                <w:rFonts w:ascii="Arial Narrow" w:hAnsi="Arial Narrow"/>
+                <w:sz w:val="20"/>
+                <w:szCs w:val="20"/>
+              </w:rPr>
+            </w:pPr>
+            <w:r>
+              <w:rPr>
+                <w:rFonts w:ascii="Arial Narrow" w:hAnsi="Arial Narrow"/>
+                <w:sz w:val="20"/>
+                <w:szCs w:val="20"/>
               </w:rPr>
               <w:t>~0.58</w:t>
             </w:r>
@@ -7263,28 +7235,23 @@
         </w:tc>
       </w:tr>
       <w:tr>
-        <w:trPr>
-          <w:cnfStyle w:val="000000100000" w:firstRow="0" w:lastRow="0" w:firstColumn="0" w:lastColumn="0" w:oddVBand="0" w:evenVBand="0" w:oddHBand="1" w:evenHBand="0" w:firstRowFirstColumn="0" w:firstRowLastColumn="0" w:lastRowFirstColumn="0" w:lastRowLastColumn="0"/>
-          <w:jc w:val="center"/>
-        </w:trPr>
-        <w:tc>
-          <w:tcPr>
-            <w:cnfStyle w:val="001000000000" w:firstRow="0" w:lastRow="0" w:firstColumn="1" w:lastColumn="0" w:oddVBand="0" w:evenVBand="0" w:oddHBand="0" w:evenHBand="0" w:firstRowFirstColumn="0" w:firstRowLastColumn="0" w:lastRowFirstColumn="0" w:lastRowLastColumn="0"/>
+        <w:tc>
+          <w:tcPr>
             <w:tcW w:w="1728" w:type="dxa"/>
           </w:tcPr>
           <w:p>
             <w:pPr>
               <w:rPr>
                 <w:rFonts w:ascii="Arial Narrow" w:hAnsi="Arial Narrow"/>
-                <w:sz w:val="24"/>
-                <w:szCs w:val="24"/>
-              </w:rPr>
-            </w:pPr>
-            <w:r>
-              <w:rPr>
-                <w:rFonts w:ascii="Arial Narrow" w:hAnsi="Arial Narrow"/>
-                <w:sz w:val="24"/>
-                <w:szCs w:val="24"/>
+                <w:sz w:val="20"/>
+                <w:szCs w:val="20"/>
+              </w:rPr>
+            </w:pPr>
+            <w:r>
+              <w:rPr>
+                <w:rFonts w:ascii="Arial Narrow" w:hAnsi="Arial Narrow"/>
+                <w:sz w:val="20"/>
+                <w:szCs w:val="20"/>
               </w:rPr>
               <w:t>KS</w:t>
             </w:r>
@@ -7296,18 +7263,17 @@
           </w:tcPr>
           <w:p>
             <w:pPr>
-              <w:cnfStyle w:val="000000100000" w:firstRow="0" w:lastRow="0" w:firstColumn="0" w:lastColumn="0" w:oddVBand="0" w:evenVBand="0" w:oddHBand="1" w:evenHBand="0" w:firstRowFirstColumn="0" w:firstRowLastColumn="0" w:lastRowFirstColumn="0" w:lastRowLastColumn="0"/>
-              <w:rPr>
-                <w:rFonts w:ascii="Arial Narrow" w:hAnsi="Arial Narrow"/>
-                <w:sz w:val="24"/>
-                <w:szCs w:val="24"/>
-              </w:rPr>
-            </w:pPr>
-            <w:r>
-              <w:rPr>
-                <w:rFonts w:ascii="Arial Narrow" w:hAnsi="Arial Narrow"/>
-                <w:sz w:val="24"/>
-                <w:szCs w:val="24"/>
+              <w:rPr>
+                <w:rFonts w:ascii="Arial Narrow" w:hAnsi="Arial Narrow"/>
+                <w:sz w:val="20"/>
+                <w:szCs w:val="20"/>
+              </w:rPr>
+            </w:pPr>
+            <w:r>
+              <w:rPr>
+                <w:rFonts w:ascii="Arial Narrow" w:hAnsi="Arial Narrow"/>
+                <w:sz w:val="20"/>
+                <w:szCs w:val="20"/>
               </w:rPr>
               <w:t>~0.32</w:t>
             </w:r>
@@ -7319,18 +7285,17 @@
           </w:tcPr>
           <w:p>
             <w:pPr>
-              <w:cnfStyle w:val="000000100000" w:firstRow="0" w:lastRow="0" w:firstColumn="0" w:lastColumn="0" w:oddVBand="0" w:evenVBand="0" w:oddHBand="1" w:evenHBand="0" w:firstRowFirstColumn="0" w:firstRowLastColumn="0" w:lastRowFirstColumn="0" w:lastRowLastColumn="0"/>
-              <w:rPr>
-                <w:rFonts w:ascii="Arial Narrow" w:hAnsi="Arial Narrow"/>
-                <w:sz w:val="24"/>
-                <w:szCs w:val="24"/>
-              </w:rPr>
-            </w:pPr>
-            <w:r>
-              <w:rPr>
-                <w:rFonts w:ascii="Arial Narrow" w:hAnsi="Arial Narrow"/>
-                <w:sz w:val="24"/>
-                <w:szCs w:val="24"/>
+              <w:rPr>
+                <w:rFonts w:ascii="Arial Narrow" w:hAnsi="Arial Narrow"/>
+                <w:sz w:val="20"/>
+                <w:szCs w:val="20"/>
+              </w:rPr>
+            </w:pPr>
+            <w:r>
+              <w:rPr>
+                <w:rFonts w:ascii="Arial Narrow" w:hAnsi="Arial Narrow"/>
+                <w:sz w:val="20"/>
+                <w:szCs w:val="20"/>
               </w:rPr>
               <w:t>~0.40</w:t>
             </w:r>
@@ -7342,18 +7307,17 @@
           </w:tcPr>
           <w:p>
             <w:pPr>
-              <w:cnfStyle w:val="000000100000" w:firstRow="0" w:lastRow="0" w:firstColumn="0" w:lastColumn="0" w:oddVBand="0" w:evenVBand="0" w:oddHBand="1" w:evenHBand="0" w:firstRowFirstColumn="0" w:firstRowLastColumn="0" w:lastRowFirstColumn="0" w:lastRowLastColumn="0"/>
-              <w:rPr>
-                <w:rFonts w:ascii="Arial Narrow" w:hAnsi="Arial Narrow"/>
-                <w:sz w:val="24"/>
-                <w:szCs w:val="24"/>
-              </w:rPr>
-            </w:pPr>
-            <w:r>
-              <w:rPr>
-                <w:rFonts w:ascii="Arial Narrow" w:hAnsi="Arial Narrow"/>
-                <w:sz w:val="24"/>
-                <w:szCs w:val="24"/>
+              <w:rPr>
+                <w:rFonts w:ascii="Arial Narrow" w:hAnsi="Arial Narrow"/>
+                <w:sz w:val="20"/>
+                <w:szCs w:val="20"/>
+              </w:rPr>
+            </w:pPr>
+            <w:r>
+              <w:rPr>
+                <w:rFonts w:ascii="Arial Narrow" w:hAnsi="Arial Narrow"/>
+                <w:sz w:val="20"/>
+                <w:szCs w:val="20"/>
               </w:rPr>
               <w:t>~0.47</w:t>
             </w:r>
@@ -7365,18 +7329,17 @@
           </w:tcPr>
           <w:p>
             <w:pPr>
-              <w:cnfStyle w:val="000000100000" w:firstRow="0" w:lastRow="0" w:firstColumn="0" w:lastColumn="0" w:oddVBand="0" w:evenVBand="0" w:oddHBand="1" w:evenHBand="0" w:firstRowFirstColumn="0" w:firstRowLastColumn="0" w:lastRowFirstColumn="0" w:lastRowLastColumn="0"/>
-              <w:rPr>
-                <w:rFonts w:ascii="Arial Narrow" w:hAnsi="Arial Narrow"/>
-                <w:sz w:val="24"/>
-                <w:szCs w:val="24"/>
-              </w:rPr>
-            </w:pPr>
-            <w:r>
-              <w:rPr>
-                <w:rFonts w:ascii="Arial Narrow" w:hAnsi="Arial Narrow"/>
-                <w:sz w:val="24"/>
-                <w:szCs w:val="24"/>
+              <w:rPr>
+                <w:rFonts w:ascii="Arial Narrow" w:hAnsi="Arial Narrow"/>
+                <w:sz w:val="20"/>
+                <w:szCs w:val="20"/>
+              </w:rPr>
+            </w:pPr>
+            <w:r>
+              <w:rPr>
+                <w:rFonts w:ascii="Arial Narrow" w:hAnsi="Arial Narrow"/>
+                <w:sz w:val="20"/>
+                <w:szCs w:val="20"/>
               </w:rPr>
               <w:t>~0.45</w:t>
             </w:r>
@@ -7384,28 +7347,23 @@
         </w:tc>
       </w:tr>
       <w:tr>
-        <w:trPr>
-          <w:cnfStyle w:val="000000010000" w:firstRow="0" w:lastRow="0" w:firstColumn="0" w:lastColumn="0" w:oddVBand="0" w:evenVBand="0" w:oddHBand="0" w:evenHBand="1" w:firstRowFirstColumn="0" w:firstRowLastColumn="0" w:lastRowFirstColumn="0" w:lastRowLastColumn="0"/>
-          <w:jc w:val="center"/>
-        </w:trPr>
-        <w:tc>
-          <w:tcPr>
-            <w:cnfStyle w:val="001000000000" w:firstRow="0" w:lastRow="0" w:firstColumn="1" w:lastColumn="0" w:oddVBand="0" w:evenVBand="0" w:oddHBand="0" w:evenHBand="0" w:firstRowFirstColumn="0" w:firstRowLastColumn="0" w:lastRowFirstColumn="0" w:lastRowLastColumn="0"/>
+        <w:tc>
+          <w:tcPr>
             <w:tcW w:w="1728" w:type="dxa"/>
           </w:tcPr>
           <w:p>
             <w:pPr>
               <w:rPr>
                 <w:rFonts w:ascii="Arial Narrow" w:hAnsi="Arial Narrow"/>
-                <w:sz w:val="24"/>
-                <w:szCs w:val="24"/>
-              </w:rPr>
-            </w:pPr>
-            <w:r>
-              <w:rPr>
-                <w:rFonts w:ascii="Arial Narrow" w:hAnsi="Arial Narrow"/>
-                <w:sz w:val="24"/>
-                <w:szCs w:val="24"/>
+                <w:sz w:val="20"/>
+                <w:szCs w:val="20"/>
+              </w:rPr>
+            </w:pPr>
+            <w:r>
+              <w:rPr>
+                <w:rFonts w:ascii="Arial Narrow" w:hAnsi="Arial Narrow"/>
+                <w:sz w:val="20"/>
+                <w:szCs w:val="20"/>
               </w:rPr>
               <w:t>F1</w:t>
             </w:r>
@@ -7417,18 +7375,17 @@
           </w:tcPr>
           <w:p>
             <w:pPr>
-              <w:cnfStyle w:val="000000010000" w:firstRow="0" w:lastRow="0" w:firstColumn="0" w:lastColumn="0" w:oddVBand="0" w:evenVBand="0" w:oddHBand="0" w:evenHBand="1" w:firstRowFirstColumn="0" w:firstRowLastColumn="0" w:lastRowFirstColumn="0" w:lastRowLastColumn="0"/>
-              <w:rPr>
-                <w:rFonts w:ascii="Arial Narrow" w:hAnsi="Arial Narrow"/>
-                <w:sz w:val="24"/>
-                <w:szCs w:val="24"/>
-              </w:rPr>
-            </w:pPr>
-            <w:r>
-              <w:rPr>
-                <w:rFonts w:ascii="Arial Narrow" w:hAnsi="Arial Narrow"/>
-                <w:sz w:val="24"/>
-                <w:szCs w:val="24"/>
+              <w:rPr>
+                <w:rFonts w:ascii="Arial Narrow" w:hAnsi="Arial Narrow"/>
+                <w:sz w:val="20"/>
+                <w:szCs w:val="20"/>
+              </w:rPr>
+            </w:pPr>
+            <w:r>
+              <w:rPr>
+                <w:rFonts w:ascii="Arial Narrow" w:hAnsi="Arial Narrow"/>
+                <w:sz w:val="20"/>
+                <w:szCs w:val="20"/>
               </w:rPr>
               <w:t>~0.56</w:t>
             </w:r>
@@ -7440,18 +7397,17 @@
           </w:tcPr>
           <w:p>
             <w:pPr>
-              <w:cnfStyle w:val="000000010000" w:firstRow="0" w:lastRow="0" w:firstColumn="0" w:lastColumn="0" w:oddVBand="0" w:evenVBand="0" w:oddHBand="0" w:evenHBand="1" w:firstRowFirstColumn="0" w:firstRowLastColumn="0" w:lastRowFirstColumn="0" w:lastRowLastColumn="0"/>
-              <w:rPr>
-                <w:rFonts w:ascii="Arial Narrow" w:hAnsi="Arial Narrow"/>
-                <w:sz w:val="24"/>
-                <w:szCs w:val="24"/>
-              </w:rPr>
-            </w:pPr>
-            <w:r>
-              <w:rPr>
-                <w:rFonts w:ascii="Arial Narrow" w:hAnsi="Arial Narrow"/>
-                <w:sz w:val="24"/>
-                <w:szCs w:val="24"/>
+              <w:rPr>
+                <w:rFonts w:ascii="Arial Narrow" w:hAnsi="Arial Narrow"/>
+                <w:sz w:val="20"/>
+                <w:szCs w:val="20"/>
+              </w:rPr>
+            </w:pPr>
+            <w:r>
+              <w:rPr>
+                <w:rFonts w:ascii="Arial Narrow" w:hAnsi="Arial Narrow"/>
+                <w:sz w:val="20"/>
+                <w:szCs w:val="20"/>
               </w:rPr>
               <w:t>~0.60</w:t>
             </w:r>
@@ -7463,18 +7419,17 @@
           </w:tcPr>
           <w:p>
             <w:pPr>
-              <w:cnfStyle w:val="000000010000" w:firstRow="0" w:lastRow="0" w:firstColumn="0" w:lastColumn="0" w:oddVBand="0" w:evenVBand="0" w:oddHBand="0" w:evenHBand="1" w:firstRowFirstColumn="0" w:firstRowLastColumn="0" w:lastRowFirstColumn="0" w:lastRowLastColumn="0"/>
-              <w:rPr>
-                <w:rFonts w:ascii="Arial Narrow" w:hAnsi="Arial Narrow"/>
-                <w:sz w:val="24"/>
-                <w:szCs w:val="24"/>
-              </w:rPr>
-            </w:pPr>
-            <w:r>
-              <w:rPr>
-                <w:rFonts w:ascii="Arial Narrow" w:hAnsi="Arial Narrow"/>
-                <w:sz w:val="24"/>
-                <w:szCs w:val="24"/>
+              <w:rPr>
+                <w:rFonts w:ascii="Arial Narrow" w:hAnsi="Arial Narrow"/>
+                <w:sz w:val="20"/>
+                <w:szCs w:val="20"/>
+              </w:rPr>
+            </w:pPr>
+            <w:r>
+              <w:rPr>
+                <w:rFonts w:ascii="Arial Narrow" w:hAnsi="Arial Narrow"/>
+                <w:sz w:val="20"/>
+                <w:szCs w:val="20"/>
               </w:rPr>
               <w:t>~0.64</w:t>
             </w:r>
@@ -7486,18 +7441,17 @@
           </w:tcPr>
           <w:p>
             <w:pPr>
-              <w:cnfStyle w:val="000000010000" w:firstRow="0" w:lastRow="0" w:firstColumn="0" w:lastColumn="0" w:oddVBand="0" w:evenVBand="0" w:oddHBand="0" w:evenHBand="1" w:firstRowFirstColumn="0" w:firstRowLastColumn="0" w:lastRowFirstColumn="0" w:lastRowLastColumn="0"/>
-              <w:rPr>
-                <w:rFonts w:ascii="Arial Narrow" w:hAnsi="Arial Narrow"/>
-                <w:sz w:val="24"/>
-                <w:szCs w:val="24"/>
-              </w:rPr>
-            </w:pPr>
-            <w:r>
-              <w:rPr>
-                <w:rFonts w:ascii="Arial Narrow" w:hAnsi="Arial Narrow"/>
-                <w:sz w:val="24"/>
-                <w:szCs w:val="24"/>
+              <w:rPr>
+                <w:rFonts w:ascii="Arial Narrow" w:hAnsi="Arial Narrow"/>
+                <w:sz w:val="20"/>
+                <w:szCs w:val="20"/>
+              </w:rPr>
+            </w:pPr>
+            <w:r>
+              <w:rPr>
+                <w:rFonts w:ascii="Arial Narrow" w:hAnsi="Arial Narrow"/>
+                <w:sz w:val="20"/>
+                <w:szCs w:val="20"/>
               </w:rPr>
               <w:t>~0.63</w:t>
             </w:r>
@@ -7505,28 +7459,23 @@
         </w:tc>
       </w:tr>
       <w:tr>
-        <w:trPr>
-          <w:cnfStyle w:val="000000100000" w:firstRow="0" w:lastRow="0" w:firstColumn="0" w:lastColumn="0" w:oddVBand="0" w:evenVBand="0" w:oddHBand="1" w:evenHBand="0" w:firstRowFirstColumn="0" w:firstRowLastColumn="0" w:lastRowFirstColumn="0" w:lastRowLastColumn="0"/>
-          <w:jc w:val="center"/>
-        </w:trPr>
-        <w:tc>
-          <w:tcPr>
-            <w:cnfStyle w:val="001000000000" w:firstRow="0" w:lastRow="0" w:firstColumn="1" w:lastColumn="0" w:oddVBand="0" w:evenVBand="0" w:oddHBand="0" w:evenHBand="0" w:firstRowFirstColumn="0" w:firstRowLastColumn="0" w:lastRowFirstColumn="0" w:lastRowLastColumn="0"/>
+        <w:tc>
+          <w:tcPr>
             <w:tcW w:w="1728" w:type="dxa"/>
           </w:tcPr>
           <w:p>
             <w:pPr>
               <w:rPr>
                 <w:rFonts w:ascii="Arial Narrow" w:hAnsi="Arial Narrow"/>
-                <w:sz w:val="24"/>
-                <w:szCs w:val="24"/>
-              </w:rPr>
-            </w:pPr>
-            <w:r>
-              <w:rPr>
-                <w:rFonts w:ascii="Arial Narrow" w:hAnsi="Arial Narrow"/>
-                <w:sz w:val="24"/>
-                <w:szCs w:val="24"/>
+                <w:sz w:val="20"/>
+                <w:szCs w:val="20"/>
+              </w:rPr>
+            </w:pPr>
+            <w:r>
+              <w:rPr>
+                <w:rFonts w:ascii="Arial Narrow" w:hAnsi="Arial Narrow"/>
+                <w:sz w:val="20"/>
+                <w:szCs w:val="20"/>
               </w:rPr>
               <w:t>PR-AUC</w:t>
             </w:r>
@@ -7538,18 +7487,17 @@
           </w:tcPr>
           <w:p>
             <w:pPr>
-              <w:cnfStyle w:val="000000100000" w:firstRow="0" w:lastRow="0" w:firstColumn="0" w:lastColumn="0" w:oddVBand="0" w:evenVBand="0" w:oddHBand="1" w:evenHBand="0" w:firstRowFirstColumn="0" w:firstRowLastColumn="0" w:lastRowFirstColumn="0" w:lastRowLastColumn="0"/>
-              <w:rPr>
-                <w:rFonts w:ascii="Arial Narrow" w:hAnsi="Arial Narrow"/>
-                <w:sz w:val="24"/>
-                <w:szCs w:val="24"/>
-              </w:rPr>
-            </w:pPr>
-            <w:r>
-              <w:rPr>
-                <w:rFonts w:ascii="Arial Narrow" w:hAnsi="Arial Narrow"/>
-                <w:sz w:val="24"/>
-                <w:szCs w:val="24"/>
+              <w:rPr>
+                <w:rFonts w:ascii="Arial Narrow" w:hAnsi="Arial Narrow"/>
+                <w:sz w:val="20"/>
+                <w:szCs w:val="20"/>
+              </w:rPr>
+            </w:pPr>
+            <w:r>
+              <w:rPr>
+                <w:rFonts w:ascii="Arial Narrow" w:hAnsi="Arial Narrow"/>
+                <w:sz w:val="20"/>
+                <w:szCs w:val="20"/>
               </w:rPr>
               <w:t>~0.63</w:t>
             </w:r>
@@ -7561,18 +7509,17 @@
           </w:tcPr>
           <w:p>
             <w:pPr>
-              <w:cnfStyle w:val="000000100000" w:firstRow="0" w:lastRow="0" w:firstColumn="0" w:lastColumn="0" w:oddVBand="0" w:evenVBand="0" w:oddHBand="1" w:evenHBand="0" w:firstRowFirstColumn="0" w:firstRowLastColumn="0" w:lastRowFirstColumn="0" w:lastRowLastColumn="0"/>
-              <w:rPr>
-                <w:rFonts w:ascii="Arial Narrow" w:hAnsi="Arial Narrow"/>
-                <w:sz w:val="24"/>
-                <w:szCs w:val="24"/>
-              </w:rPr>
-            </w:pPr>
-            <w:r>
-              <w:rPr>
-                <w:rFonts w:ascii="Arial Narrow" w:hAnsi="Arial Narrow"/>
-                <w:sz w:val="24"/>
-                <w:szCs w:val="24"/>
+              <w:rPr>
+                <w:rFonts w:ascii="Arial Narrow" w:hAnsi="Arial Narrow"/>
+                <w:sz w:val="20"/>
+                <w:szCs w:val="20"/>
+              </w:rPr>
+            </w:pPr>
+            <w:r>
+              <w:rPr>
+                <w:rFonts w:ascii="Arial Narrow" w:hAnsi="Arial Narrow"/>
+                <w:sz w:val="20"/>
+                <w:szCs w:val="20"/>
               </w:rPr>
               <w:t>~0.68</w:t>
             </w:r>
@@ -7584,18 +7531,17 @@
           </w:tcPr>
           <w:p>
             <w:pPr>
-              <w:cnfStyle w:val="000000100000" w:firstRow="0" w:lastRow="0" w:firstColumn="0" w:lastColumn="0" w:oddVBand="0" w:evenVBand="0" w:oddHBand="1" w:evenHBand="0" w:firstRowFirstColumn="0" w:firstRowLastColumn="0" w:lastRowFirstColumn="0" w:lastRowLastColumn="0"/>
-              <w:rPr>
-                <w:rFonts w:ascii="Arial Narrow" w:hAnsi="Arial Narrow"/>
-                <w:sz w:val="24"/>
-                <w:szCs w:val="24"/>
-              </w:rPr>
-            </w:pPr>
-            <w:r>
-              <w:rPr>
-                <w:rFonts w:ascii="Arial Narrow" w:hAnsi="Arial Narrow"/>
-                <w:sz w:val="24"/>
-                <w:szCs w:val="24"/>
+              <w:rPr>
+                <w:rFonts w:ascii="Arial Narrow" w:hAnsi="Arial Narrow"/>
+                <w:sz w:val="20"/>
+                <w:szCs w:val="20"/>
+              </w:rPr>
+            </w:pPr>
+            <w:r>
+              <w:rPr>
+                <w:rFonts w:ascii="Arial Narrow" w:hAnsi="Arial Narrow"/>
+                <w:sz w:val="20"/>
+                <w:szCs w:val="20"/>
               </w:rPr>
               <w:t>~0.73</w:t>
             </w:r>
@@ -7607,18 +7553,17 @@
           </w:tcPr>
           <w:p>
             <w:pPr>
-              <w:cnfStyle w:val="000000100000" w:firstRow="0" w:lastRow="0" w:firstColumn="0" w:lastColumn="0" w:oddVBand="0" w:evenVBand="0" w:oddHBand="1" w:evenHBand="0" w:firstRowFirstColumn="0" w:firstRowLastColumn="0" w:lastRowFirstColumn="0" w:lastRowLastColumn="0"/>
-              <w:rPr>
-                <w:rFonts w:ascii="Arial Narrow" w:hAnsi="Arial Narrow"/>
-                <w:sz w:val="24"/>
-                <w:szCs w:val="24"/>
-              </w:rPr>
-            </w:pPr>
-            <w:r>
-              <w:rPr>
-                <w:rFonts w:ascii="Arial Narrow" w:hAnsi="Arial Narrow"/>
-                <w:sz w:val="24"/>
-                <w:szCs w:val="24"/>
+              <w:rPr>
+                <w:rFonts w:ascii="Arial Narrow" w:hAnsi="Arial Narrow"/>
+                <w:sz w:val="20"/>
+                <w:szCs w:val="20"/>
+              </w:rPr>
+            </w:pPr>
+            <w:r>
+              <w:rPr>
+                <w:rFonts w:ascii="Arial Narrow" w:hAnsi="Arial Narrow"/>
+                <w:sz w:val="20"/>
+                <w:szCs w:val="20"/>
               </w:rPr>
               <w:t>~0.72</w:t>
             </w:r>
@@ -7864,43 +7809,43 @@
           <w:sz w:val="24"/>
           <w:szCs w:val="24"/>
         </w:rPr>
+        <w:t>F1 en umbral óptimo: ~0.64</w:t>
+      </w:r>
+    </w:p>
+    <w:p>
+      <w:pPr>
+        <w:pStyle w:val="Listaconvietas"/>
+        <w:rPr>
+          <w:rFonts w:ascii="Arial Narrow" w:hAnsi="Arial Narrow"/>
+          <w:sz w:val="24"/>
+          <w:szCs w:val="24"/>
+        </w:rPr>
+      </w:pPr>
+      <w:r>
+        <w:rPr>
+          <w:rFonts w:ascii="Arial Narrow" w:hAnsi="Arial Narrow"/>
+          <w:sz w:val="24"/>
+          <w:szCs w:val="24"/>
+        </w:rPr>
+        <w:t>Precision: ~0.62  |  Recall: ~0.66</w:t>
+      </w:r>
+    </w:p>
+    <w:p>
+      <w:pPr>
+        <w:pStyle w:val="Ttulo2"/>
+        <w:rPr>
+          <w:rFonts w:ascii="Arial Narrow" w:hAnsi="Arial Narrow"/>
+          <w:sz w:val="24"/>
+          <w:szCs w:val="24"/>
+        </w:rPr>
+      </w:pPr>
+      <w:r>
+        <w:rPr>
+          <w:rFonts w:ascii="Arial Narrow" w:hAnsi="Arial Narrow"/>
+          <w:sz w:val="24"/>
+          <w:szCs w:val="24"/>
+        </w:rPr>
         <w:lastRenderedPageBreak/>
-        <w:t>F1 en umbral óptimo: ~0.64</w:t>
-      </w:r>
-    </w:p>
-    <w:p>
-      <w:pPr>
-        <w:pStyle w:val="Listaconvietas"/>
-        <w:rPr>
-          <w:rFonts w:ascii="Arial Narrow" w:hAnsi="Arial Narrow"/>
-          <w:sz w:val="24"/>
-          <w:szCs w:val="24"/>
-        </w:rPr>
-      </w:pPr>
-      <w:r>
-        <w:rPr>
-          <w:rFonts w:ascii="Arial Narrow" w:hAnsi="Arial Narrow"/>
-          <w:sz w:val="24"/>
-          <w:szCs w:val="24"/>
-        </w:rPr>
-        <w:t>Precision: ~0.62  |  Recall: ~0.66</w:t>
-      </w:r>
-    </w:p>
-    <w:p>
-      <w:pPr>
-        <w:pStyle w:val="Ttulo2"/>
-        <w:rPr>
-          <w:rFonts w:ascii="Arial Narrow" w:hAnsi="Arial Narrow"/>
-          <w:sz w:val="24"/>
-          <w:szCs w:val="24"/>
-        </w:rPr>
-      </w:pPr>
-      <w:r>
-        <w:rPr>
-          <w:rFonts w:ascii="Arial Narrow" w:hAnsi="Arial Narrow"/>
-          <w:sz w:val="24"/>
-          <w:szCs w:val="24"/>
-        </w:rPr>
         <w:t>8.4 Calibración</w:t>
       </w:r>
     </w:p>
@@ -8779,25 +8724,25 @@
           <w:sz w:val="24"/>
           <w:szCs w:val="24"/>
         </w:rPr>
+        <w:t>KS estabilidad val/OOT: &lt; 0.10 → Modelo estable. Las distribuciones de scores son consistentes entre la ventana de validación y el periodo OOT, lo que indica que el modelo no sufre de concept drift significativo.</w:t>
+      </w:r>
+    </w:p>
+    <w:p>
+      <w:pPr>
+        <w:pStyle w:val="Ttulo1"/>
+        <w:rPr>
+          <w:rFonts w:ascii="Arial Narrow" w:hAnsi="Arial Narrow"/>
+          <w:sz w:val="24"/>
+          <w:szCs w:val="24"/>
+        </w:rPr>
+      </w:pPr>
+      <w:r>
+        <w:rPr>
+          <w:rFonts w:ascii="Arial Narrow" w:hAnsi="Arial Narrow"/>
+          <w:sz w:val="24"/>
+          <w:szCs w:val="24"/>
+        </w:rPr>
         <w:lastRenderedPageBreak/>
-        <w:t>KS estabilidad val/OOT: &lt; 0.10 → Modelo estable. Las distribuciones de scores son consistentes entre la ventana de validación y el periodo OOT, lo que indica que el modelo no sufre de concept drift significativo.</w:t>
-      </w:r>
-    </w:p>
-    <w:p>
-      <w:pPr>
-        <w:pStyle w:val="Ttulo1"/>
-        <w:rPr>
-          <w:rFonts w:ascii="Arial Narrow" w:hAnsi="Arial Narrow"/>
-          <w:sz w:val="24"/>
-          <w:szCs w:val="24"/>
-        </w:rPr>
-      </w:pPr>
-      <w:r>
-        <w:rPr>
-          <w:rFonts w:ascii="Arial Narrow" w:hAnsi="Arial Narrow"/>
-          <w:sz w:val="24"/>
-          <w:szCs w:val="24"/>
-        </w:rPr>
         <w:t>10. Arquitectura del Pipeline Productivo</w:t>
       </w:r>
     </w:p>
@@ -9194,7 +9139,6 @@
           <w:sz w:val="24"/>
           <w:szCs w:val="24"/>
         </w:rPr>
-        <w:lastRenderedPageBreak/>
         <w:t>10.</w:t>
       </w:r>
       <w:r>
@@ -9397,6 +9341,7 @@
                 <w:sz w:val="20"/>
                 <w:szCs w:val="20"/>
               </w:rPr>
+              <w:lastRenderedPageBreak/>
               <w:t>CargaLz</w:t>
             </w:r>
           </w:p>
@@ -9886,6 +9831,7 @@
                 <w:sz w:val="20"/>
                 <w:szCs w:val="20"/>
               </w:rPr>
+              <w:lastRenderedPageBreak/>
               <w:t>Storage</w:t>
             </w:r>
             <w:r>
@@ -10277,6 +10223,25 @@
           <w:szCs w:val="24"/>
         </w:rPr>
       </w:pPr>
+      <w:r>
+        <w:rPr>
+          <w:rFonts w:ascii="Arial Narrow" w:hAnsi="Arial Narrow"/>
+          <w:sz w:val="24"/>
+          <w:szCs w:val="24"/>
+        </w:rPr>
+        <w:t xml:space="preserve"> </w:t>
+      </w:r>
+      <w:hyperlink r:id="rId8" w:history="1">
+        <w:r>
+          <w:rPr>
+            <w:rStyle w:val="Hipervnculo"/>
+            <w:rFonts w:ascii="Arial Narrow" w:hAnsi="Arial Narrow"/>
+            <w:sz w:val="24"/>
+            <w:szCs w:val="24"/>
+          </w:rPr>
+          <w:t>https://github.com/Daetobo/prueba_modelo_analitico_propension</w:t>
+        </w:r>
+      </w:hyperlink>
       <w:r>
         <w:rPr>
           <w:rFonts w:ascii="Arial Narrow" w:hAnsi="Arial Narrow"/>
@@ -22036,6 +22001,29 @@
       </w:tblBorders>
     </w:tblPr>
   </w:style>
+  <w:style w:type="character" w:styleId="Hipervnculo">
+    <w:name w:val="Hyperlink"/>
+    <w:basedOn w:val="Fuentedeprrafopredeter"/>
+    <w:uiPriority w:val="99"/>
+    <w:unhideWhenUsed/>
+    <w:rsid w:val="00506586"/>
+    <w:rPr>
+      <w:color w:val="0000FF" w:themeColor="hyperlink"/>
+      <w:u w:val="single"/>
+    </w:rPr>
+  </w:style>
+  <w:style w:type="character" w:styleId="Mencinsinresolver">
+    <w:name w:val="Unresolved Mention"/>
+    <w:basedOn w:val="Fuentedeprrafopredeter"/>
+    <w:uiPriority w:val="99"/>
+    <w:semiHidden/>
+    <w:unhideWhenUsed/>
+    <w:rsid w:val="00506586"/>
+    <w:rPr>
+      <w:color w:val="605E5C"/>
+      <w:shd w:val="clear" w:color="auto" w:fill="E1DFDD"/>
+    </w:rPr>
+  </w:style>
 </w:styles>
 </file>
 

</xml_diff>